<commit_message>
feat: parada antecipada, busca de parametros, validacao cruzada e datasets autoral/Iris
- Parada antecipada (paciencia sobre MSE de validacao) em entities.py, por dataset em config.py
- Grid search em busca_parametros.py + resultados em saidas (confirma config do CARACTERES_COMPLETO)
- Validacao cruzada k-fold (validacao.py) com diagrama; HOLD_OUT x CROSS_VALIDATION por enum
- Variacao autoral (ruido 10%) em data/caracteres_completo_autoral/ via gerar_variacao_autoral.py
- Dataset externo Iris em data/iris/
- Teste de mesa como data_choice; checklist e TODO atualizados
</commit_message>
<xml_diff>
--- a/docs/Checklist_preenchido.docx
+++ b/docs/Checklist_preenchido.docx
@@ -785,12 +785,9 @@
             <w:tcW w:w="1411" w:type="dxa"/>
           </w:tcPr>
           <w:p>
-            <w:pPr>
-              <w:jc w:val="center"/>
-              <w:rPr>
-                <w:lang w:val="pt-BR"/>
-              </w:rPr>
-            </w:pPr>
+            <w:r>
+              <w:t>X</w:t>
+            </w:r>
           </w:p>
         </w:tc>
       </w:tr>
@@ -882,12 +879,9 @@
             <w:tcW w:w="1411" w:type="dxa"/>
           </w:tcPr>
           <w:p>
-            <w:pPr>
-              <w:jc w:val="center"/>
-              <w:rPr>
-                <w:lang w:val="pt-BR"/>
-              </w:rPr>
-            </w:pPr>
+            <w:r>
+              <w:t>X</w:t>
+            </w:r>
           </w:p>
         </w:tc>
       </w:tr>
@@ -915,12 +909,9 @@
             <w:tcW w:w="1411" w:type="dxa"/>
           </w:tcPr>
           <w:p>
-            <w:pPr>
-              <w:jc w:val="center"/>
-              <w:rPr>
-                <w:lang w:val="pt-BR"/>
-              </w:rPr>
-            </w:pPr>
+            <w:r>
+              <w:t>X</w:t>
+            </w:r>
           </w:p>
         </w:tc>
       </w:tr>
@@ -1128,12 +1119,9 @@
             <w:tcW w:w="1411" w:type="dxa"/>
           </w:tcPr>
           <w:p>
-            <w:pPr>
-              <w:jc w:val="center"/>
-              <w:rPr>
-                <w:lang w:val="pt-BR"/>
-              </w:rPr>
-            </w:pPr>
+            <w:r>
+              <w:t>X</w:t>
+            </w:r>
           </w:p>
         </w:tc>
       </w:tr>
@@ -1339,7 +1327,7 @@
           </w:tcPr>
           <w:p>
             <w:r>
-              <w:t>Codigo documentado com a nomenclatura do Fausett (v_ij, w_jk, z_in_j, y_k, delta, alpha)</w:t>
+              <w:t>Código documentado com a nomenclatura do Fausett (v_ij, w_jk, z_in_j, y_k, delta, alpha)</w:t>
             </w:r>
           </w:p>
         </w:tc>
@@ -1361,7 +1349,7 @@
           </w:tcPr>
           <w:p>
             <w:r>
-              <w:t>Nome completo + numero USP dos integrantes</w:t>
+              <w:t>Nome completo + número USP dos integrantes</w:t>
             </w:r>
           </w:p>
         </w:tc>
@@ -1383,6 +1371,28 @@
           </w:tcPr>
           <w:p>
             <w:r>
+              <w:t>Conferência com o teste de mesa (exemplo numérico do PDF): rede 2-&gt;3-&gt;2, x=[1,1], t=[1,0], alpha=0.5</w:t>
+            </w:r>
+          </w:p>
+        </w:tc>
+        <w:tc>
+          <w:tcPr>
+            <w:tcW w:type="dxa" w:w="1411"/>
+          </w:tcPr>
+          <w:p>
+            <w:r>
+              <w:t>src/mlp/teste_de_mesa.py (módulo completo), executado pelo main.py via data_choice TESTE_DE_MESA (src/mlp/main.py linhas 125-131). Compara z_j, y_k, delta_k, delta_j^h e os 17 pesos atualizados; os 27 valores conferem. Roda no inicio de: python src/mlp/main.py</w:t>
+            </w:r>
+          </w:p>
+        </w:tc>
+      </w:tr>
+      <w:tr>
+        <w:tc>
+          <w:tcPr>
+            <w:tcW w:type="dxa" w:w="7083"/>
+          </w:tcPr>
+          <w:p>
+            <w:r>
               <w:t>UMA camada escondida</w:t>
             </w:r>
           </w:p>
@@ -1405,7 +1415,7 @@
           </w:tcPr>
           <w:p>
             <w:r>
-              <w:t>Erro Quadratico Medio (MSE)</w:t>
+              <w:t>Erro Quadrático Médio (MSE)</w:t>
             </w:r>
           </w:p>
         </w:tc>
@@ -1415,7 +1425,7 @@
           </w:tcPr>
           <w:p>
             <w:r>
-              <w:t>src/mlp/entities.py linhas 149-158 (acumulo de (t_k - y_k)^2 e MSE por epoca); src/mlp/saidas.py linhas 83-88 (erro_por_epoca.csv)</w:t>
+              <w:t>src/mlp/entities.py linhas 149-160 (acumulo de (t_k - y_k)^2 e MSE por epoca); src/mlp/saidas.py (salvar_erro_por_epoca -&gt; erro_por_epoca.csv)</w:t>
             </w:r>
           </w:p>
         </w:tc>
@@ -1449,7 +1459,7 @@
           </w:tcPr>
           <w:p>
             <w:r>
-              <w:t>Hold out 80/10/10 (treino/validacao/teste)</w:t>
+              <w:t>Parada antecipada (early stopping por paciência no MSE de validação)</w:t>
             </w:r>
           </w:p>
         </w:tc>
@@ -1459,7 +1469,7 @@
           </w:tcPr>
           <w:p>
             <w:r>
-              <w:t>src/mlp/datasets.py linhas 74-80 e 101-110 (splits); src/mlp/entities.py linhas 161-172 (MSE de validacao por epoca)</w:t>
+              <w:t>src/mlp/entities.py linhas 145-146 (estado: melhor MSE e contador) e 177-186 (compara com o melhor e da break ao estourar a paciencia); paciencia por dataset em src/mlp/config.py. Testada: CARACTERES_COMPLETO parou na epoca 208/300 e a acuracia subiu de 88% para 94%.</w:t>
             </w:r>
           </w:p>
         </w:tc>
@@ -1471,7 +1481,7 @@
           </w:tcPr>
           <w:p>
             <w:r>
-              <w:t>Modelagem de classificacao binaria (portas logicas OR/AND/XOR)</w:t>
+              <w:t>Busca de parâmetros (grid search: taxa x neurônios x paciência)</w:t>
             </w:r>
           </w:p>
         </w:tc>
@@ -1481,7 +1491,7 @@
           </w:tcPr>
           <w:p>
             <w:r>
-              <w:t>src/mlp/datasets.py linhas 40-58 (1 neuronio de saida)</w:t>
+              <w:t>src/mlp/busca_parametros.py (grid search; ranking pelo menor MSE de validacao; paciencias simuladas sobre a mesma curva). Saida: saidas/mlp/caracteres_completo/busca_parametros.csv</w:t>
             </w:r>
           </w:p>
         </w:tc>
@@ -1493,7 +1503,7 @@
           </w:tcPr>
           <w:p>
             <w:r>
-              <w:t>Avaliacao de classificacao binaria</w:t>
+              <w:t>Variações (autorais) do conjunto de teste</w:t>
             </w:r>
           </w:p>
         </w:tc>
@@ -1503,7 +1513,7 @@
           </w:tcPr>
           <w:p>
             <w:r>
-              <w:t>src/mlp/entities.py linhas 186-189 (limiar 0.5); src/mlp/saidas.py linhas 291-316 (acuracia e matriz de confusao)</w:t>
+              <w:t>src/mlp/gerar_variacao_autoral.py gera data/caracteres_completo_autoral/X_ruido.npy (10% dos pixels invertidos, seed fixa). Loader em src/mlp/datasets.py linhas 123-162 (treino/validacao nos dados originais; SO o teste usa o ruido autoral - linha 150). data_choice CARACTERES_COMPLETO_AUTORAL.</w:t>
             </w:r>
           </w:p>
         </w:tc>
@@ -1515,7 +1525,7 @@
           </w:tcPr>
           <w:p>
             <w:r>
-              <w:t>Conferencia com o teste de mesa (exemplo numerico do PDF): rede 2-&gt;3-&gt;2, x=[1,1], t=[1,0], alpha=0.5</w:t>
+              <w:t>Hold out E validação cruzada (k-fold)</w:t>
             </w:r>
           </w:p>
         </w:tc>
@@ -1525,7 +1535,73 @@
           </w:tcPr>
           <w:p>
             <w:r>
-              <w:t>src/mlp/teste_de_mesa.py (modulo completo), executado pelo main.py via data_choice TESTE_DE_MESA (src/mlp/main.py linhas 123-128) - compara z_j, y_k, delta_k, delta_j^h e os 17 pesos atualizados; todos os 27 valores conferem. Roda automaticamente no inicio de: python src/mlp/main.py</w:t>
+              <w:t>Hold out 80/10/10: src/mlp/datasets.py. Validacao cruzada: src/mlp/validacao.py (validacao_cruzada, k-fold sobre treino+validacao); escolhido por dataset em src/mlp/config.py (CARACTERES_REDUZIDO 7-fold, CARACTERES_COMPLETO 5-fold). Diagrama salvo em saidas/mlp/&lt;dataset&gt;/validacao_cruzada.png.</w:t>
+            </w:r>
+          </w:p>
+        </w:tc>
+      </w:tr>
+      <w:tr>
+        <w:tc>
+          <w:tcPr>
+            <w:tcW w:type="dxa" w:w="7083"/>
+          </w:tcPr>
+          <w:p>
+            <w:r>
+              <w:t>Teste com outros conjuntos de dados (Iris)</w:t>
+            </w:r>
+          </w:p>
+        </w:tc>
+        <w:tc>
+          <w:tcPr>
+            <w:tcW w:type="dxa" w:w="1411"/>
+          </w:tcPr>
+          <w:p>
+            <w:r>
+              <w:t>Dataset externo Iris em data/iris/iris.csv (150 amostras, 4 atributos, 3 classes). Loader com normalizacao min-max em src/mlp/datasets.py linhas 165-188; data_choice IRIS. Acuracia de teste: 100%.</w:t>
+            </w:r>
+          </w:p>
+        </w:tc>
+      </w:tr>
+      <w:tr>
+        <w:tc>
+          <w:tcPr>
+            <w:tcW w:type="dxa" w:w="7083"/>
+          </w:tcPr>
+          <w:p>
+            <w:r>
+              <w:t>Modelagem de classificação binária (portas lógicas OR/AND/XOR)</w:t>
+            </w:r>
+          </w:p>
+        </w:tc>
+        <w:tc>
+          <w:tcPr>
+            <w:tcW w:type="dxa" w:w="1411"/>
+          </w:tcPr>
+          <w:p>
+            <w:r>
+              <w:t>src/mlp/datasets.py linhas 42-59 (1 neuronio de saida, num_saidas=1)</w:t>
+            </w:r>
+          </w:p>
+        </w:tc>
+      </w:tr>
+      <w:tr>
+        <w:tc>
+          <w:tcPr>
+            <w:tcW w:type="dxa" w:w="7083"/>
+          </w:tcPr>
+          <w:p>
+            <w:r>
+              <w:t>Avaliação de classificação binária</w:t>
+            </w:r>
+          </w:p>
+        </w:tc>
+        <w:tc>
+          <w:tcPr>
+            <w:tcW w:type="dxa" w:w="1411"/>
+          </w:tcPr>
+          <w:p>
+            <w:r>
+              <w:t>src/mlp/entities.py linhas 200-202 (limiar 0.5 na saida da sigmoide); matriz de confusao em src/mlp/saidas.py linha 347</w:t>
             </w:r>
           </w:p>
         </w:tc>

</xml_diff>